<commit_message>
fix: harden workflow lifecycle handling
</commit_message>
<xml_diff>
--- a/docs/商务部小J智能体上线试用通知及使用说明.docx
+++ b/docs/商务部小J智能体上线试用通知及使用说明.docx
@@ -133,8 +133,6 @@
         </w:rPr>
         <w:t>发布日期：2026-04-23</w:t>
       </w:r>
-      <w:bookmarkStart w:id="0" w:name="_GoBack"/>
-      <w:bookmarkEnd w:id="0"/>
     </w:p>
     <w:p>
       <w:pPr>
@@ -180,6 +178,11 @@
       </w:pPr>
       <w:r>
         <w:t>上线目标：降低重复人工操作，提升流转效率与准确性，统一任务编号与状态口径，强化全流程可追溯能力。</w:t>
+      </w:r>
+    </w:p>
+    <w:p>
+      <w:r>
+        <w:t>本次规则更新：新增“24小时重复提交查重”“初审通过回传任务号”“按任务号撤回需求（生产未确认排单前）”“撤回后双向自动通知”。</w:t>
       </w:r>
     </w:p>
     <w:p>
@@ -352,11 +355,26 @@
       </w:r>
     </w:p>
     <w:p>
+      <w:r>
+        <w:t>4. 初审通过后，小J会在回邮中明确反馈任务号（PT-YYYYMMDD-XXXX），后续变更与撤回请务必引用该任务号。</w:t>
+      </w:r>
+    </w:p>
+    <w:p>
+      <w:r>
+        <w:t>5. 初审已包含24小时查重：同一销售同一需求在1天内重复提交时，系统将明确回复“已提交，请勿重复提交”，且不会重复创建任务。</w:t>
+      </w:r>
+    </w:p>
+    <w:p>
+      <w:r>
+        <w:t>6. 如需撤回需求，请发送“撤回需求 + 任务号”；仅在生产未确认排单前可撤回。撤回后系统会自动关闭任务，并同步通知销售侧与生产侧。</w:t>
+      </w:r>
+    </w:p>
+    <w:p>
       <w:pPr>
         <w:ind w:firstLine="0"/>
       </w:pPr>
       <w:r>
-        <w:t>4. 收到“生产疑问”邮件后，请逐条明确答复，避免“待确认/稍后补充”等模糊描述。</w:t>
+        <w:t>7. 收到“生产疑问”邮件后，请逐条明确答复，避免“待确认/稍后补充”等模糊描述。</w:t>
       </w:r>
     </w:p>
     <w:p>
@@ -368,11 +386,7 @@
         </w:rPr>
       </w:pPr>
       <w:r>
-        <w:rPr>
-          <w:rFonts w:hint="eastAsia"/>
-          <w:lang w:val="en-US" w:eastAsia="zh-CN"/>
-        </w:rPr>
-        <w:t>5. 与小J沟通频率不宜过高，建议5分钟内沟通1次。</w:t>
+        <w:t>8. 与小J沟通频率不宜过高，建议5分钟内沟通1次。</w:t>
       </w:r>
     </w:p>
     <w:p>
@@ -644,7 +658,43 @@
         <w:ind w:firstLine="0"/>
       </w:pPr>
       <w:r>
-        <w:t>3. 高风险场景（订单取消、已排产后变更、路由缺失、答复不充分）必须人工确认。</w:t>
+        <w:t>3. 高风险场景（订单取消、已排产后变更、路由缺失、答复不充分）必须人工确认；其中 route_is_configured=False 时，即使初审通过也不会自动创建任务，异常中会明确提示先配置生产</w:t>
+      </w:r>
+      <w:r>
+        <w:rPr>
+          <w:rFonts w:hint="eastAsia"/>
+          <w:lang w:val="en-US" w:eastAsia="zh-CN"/>
+        </w:rPr>
+        <w:t>端</w:t>
+      </w:r>
+      <w:r>
+        <w:t>路由</w:t>
+      </w:r>
+      <w:r>
+        <w:rPr>
+          <w:rFonts w:hint="eastAsia"/>
+          <w:lang w:eastAsia="zh-CN"/>
+        </w:rPr>
+        <w:t>（</w:t>
+      </w:r>
+      <w:r>
+        <w:rPr>
+          <w:rFonts w:hint="eastAsia"/>
+          <w:lang w:val="en-US" w:eastAsia="zh-CN"/>
+        </w:rPr>
+        <w:t>即，生产部门接头人邮箱</w:t>
+      </w:r>
+      <w:bookmarkStart w:id="0" w:name="_GoBack"/>
+      <w:bookmarkEnd w:id="0"/>
+      <w:r>
+        <w:rPr>
+          <w:rFonts w:hint="eastAsia"/>
+          <w:lang w:eastAsia="zh-CN"/>
+        </w:rPr>
+        <w:t>）</w:t>
+      </w:r>
+      <w:r>
+        <w:t>。</w:t>
       </w:r>
     </w:p>
     <w:p>
@@ -700,6 +750,10 @@
         <w:t>4. 发现错发、漏发、重复下达或状态异常，请第一时间联系支持人员。</w:t>
       </w:r>
     </w:p>
+    <w:p/>
+    <w:p/>
+    <w:p/>
+    <w:p/>
     <w:sectPr>
       <w:footerReference r:id="rId5" w:type="default"/>
       <w:pgSz w:w="12240" w:h="15840"/>

</xml_diff>